<commit_message>
Modificación DER en Documento
</commit_message>
<xml_diff>
--- a/Informe TPI - BDII - Equipo 29.docx
+++ b/Informe TPI - BDII - Equipo 29.docx
@@ -675,15 +675,7 @@
         <w:t>de carácter general</w:t>
       </w:r>
       <w:r>
-        <w:t xml:space="preserve">. El propósito </w:t>
-      </w:r>
-      <w:proofErr w:type="gramStart"/>
-      <w:r>
-        <w:t>del mismo</w:t>
-      </w:r>
-      <w:proofErr w:type="gramEnd"/>
-      <w:r>
-        <w:t xml:space="preserve"> es facilitar la administración del local, contando con diversas funcionalidades para registrar los movimientos del día a día, y en base a ellas, obtener métricas y reportes para llevar un control del modelo de negocio.</w:t>
+        <w:t>. El propósito del mismo es facilitar la administración del local, contando con diversas funcionalidades para registrar los movimientos del día a día, y en base a ellas, obtener métricas y reportes para llevar un control del modelo de negocio.</w:t>
       </w:r>
     </w:p>
     <w:p>
@@ -828,7 +820,6 @@
       <w:bookmarkStart w:id="2" w:name="_g1m16btulxhi" w:colFirst="0" w:colLast="0"/>
       <w:bookmarkEnd w:id="2"/>
       <w:r>
-        <w:lastRenderedPageBreak/>
         <w:t>Diagrama de Entidad Relación</w:t>
       </w:r>
     </w:p>
@@ -844,9 +835,9 @@
           <w:highlight w:val="darkGray"/>
         </w:rPr>
         <w:drawing>
-          <wp:inline distT="0" distB="0" distL="0" distR="0" wp14:anchorId="0E2D267F" wp14:editId="6DFCDC62">
-            <wp:extent cx="4566613" cy="3895725"/>
-            <wp:effectExtent l="0" t="0" r="5715" b="0"/>
+          <wp:inline distT="0" distB="0" distL="0" distR="0" wp14:anchorId="0E2D267F" wp14:editId="123D009F">
+            <wp:extent cx="4576825" cy="1895091"/>
+            <wp:effectExtent l="0" t="0" r="0" b="0"/>
             <wp:docPr id="1478058877" name="Imagen 1"/>
             <wp:cNvGraphicFramePr>
               <a:graphicFrameLocks xmlns:a="http://schemas.openxmlformats.org/drawingml/2006/main" noChangeAspect="1"/>
@@ -855,17 +846,18 @@
               <a:graphicData uri="http://schemas.openxmlformats.org/drawingml/2006/picture">
                 <pic:pic xmlns:pic="http://schemas.openxmlformats.org/drawingml/2006/picture">
                   <pic:nvPicPr>
-                    <pic:cNvPr id="1478058877" name="Imagen 1478058877"/>
+                    <pic:cNvPr id="1478058877" name="Imagen 1"/>
                     <pic:cNvPicPr/>
                   </pic:nvPicPr>
-                  <pic:blipFill>
-                    <a:blip r:embed="rId9">
+                  <pic:blipFill rotWithShape="1">
+                    <a:blip r:embed="rId9" cstate="print">
                       <a:extLst>
                         <a:ext uri="{28A0092B-C50C-407E-A947-70E740481C1C}">
                           <a14:useLocalDpi xmlns:a14="http://schemas.microsoft.com/office/drawing/2010/main" val="0"/>
                         </a:ext>
                       </a:extLst>
                     </a:blip>
+                    <a:srcRect l="4012" t="4010" r="8397" b="8395"/>
                     <a:stretch>
                       <a:fillRect/>
                     </a:stretch>
@@ -873,7 +865,7 @@
                   <pic:spPr>
                     <a:xfrm>
                       <a:off x="0" y="0"/>
-                      <a:ext cx="4576825" cy="3904437"/>
+                      <a:ext cx="4576825" cy="1895091"/>
                     </a:xfrm>
                     <a:prstGeom prst="rect">
                       <a:avLst/>
@@ -893,6 +885,7 @@
       <w:bookmarkStart w:id="3" w:name="_1sibs5v9bldx" w:colFirst="0" w:colLast="0"/>
       <w:bookmarkEnd w:id="3"/>
       <w:r>
+        <w:lastRenderedPageBreak/>
         <w:t>Objetos de Base de Datos clave en el sistema</w:t>
       </w:r>
     </w:p>
@@ -931,15 +924,7 @@
         <w:t xml:space="preserve"> nos devuelve un listado de todos los ítems </w:t>
       </w:r>
       <w:r>
-        <w:t xml:space="preserve">de la tabla de Stock con el nombre del articulo y la cantidad </w:t>
-      </w:r>
-      <w:proofErr w:type="gramStart"/>
-      <w:r>
-        <w:t>del mismo</w:t>
-      </w:r>
-      <w:proofErr w:type="gramEnd"/>
-      <w:r>
-        <w:t>.</w:t>
+        <w:t>de la tabla de Stock con el nombre del articulo y la cantidad del mismo.</w:t>
       </w:r>
     </w:p>
     <w:p>
@@ -955,15 +940,7 @@
         <w:ind w:firstLine="0"/>
       </w:pPr>
       <w:r>
-        <w:t xml:space="preserve">La vista usa un INNER JOIN para poder mostrar el Nombre del articulo junto con la cantidad </w:t>
-      </w:r>
-      <w:proofErr w:type="gramStart"/>
-      <w:r>
-        <w:t>filtrando emparejando</w:t>
-      </w:r>
-      <w:proofErr w:type="gramEnd"/>
-      <w:r>
-        <w:t xml:space="preserve"> el </w:t>
+        <w:t xml:space="preserve">La vista usa un INNER JOIN para poder mostrar el Nombre del articulo junto con la cantidad filtrando emparejando el </w:t>
       </w:r>
       <w:proofErr w:type="spellStart"/>
       <w:r>
@@ -1622,7 +1599,6 @@
         <w:ind w:firstLine="0"/>
       </w:pPr>
       <w:r>
-        <w:lastRenderedPageBreak/>
         <w:t>La misma nos trae las siguientes columnas:</w:t>
       </w:r>
     </w:p>
@@ -1657,15 +1633,7 @@
         <w:ind w:firstLine="0"/>
       </w:pPr>
       <w:r>
-        <w:t xml:space="preserve">La vista simplifica los JOINS, para que podamos filtrar detalles de una venta por su ID, y ver los artículos de esa venta, ver los artículos que se vendieron en un </w:t>
-      </w:r>
-      <w:proofErr w:type="gramStart"/>
-      <w:r>
-        <w:t>lapso de tiempo</w:t>
-      </w:r>
-      <w:proofErr w:type="gramEnd"/>
-      <w:r>
-        <w:t xml:space="preserve">, sacar conclusiones de negocio mediante los </w:t>
+        <w:t xml:space="preserve">La vista simplifica los JOINS, para que podamos filtrar detalles de una venta por su ID, y ver los artículos de esa venta, ver los artículos que se vendieron en un lapso de tiempo, sacar conclusiones de negocio mediante los </w:t>
       </w:r>
       <w:proofErr w:type="spellStart"/>
       <w:r>
@@ -3276,10 +3244,7 @@
       <w:bookmarkStart w:id="6" w:name="_9j1mgf35kan8" w:colFirst="0" w:colLast="0"/>
       <w:bookmarkEnd w:id="6"/>
       <w:r>
-        <w:t xml:space="preserve">Vista </w:t>
-      </w:r>
-      <w:r>
-        <w:t>4</w:t>
+        <w:t>Vista 4</w:t>
       </w:r>
     </w:p>
     <w:p>
@@ -3298,17 +3263,7 @@
           <w:color w:val="000000"/>
           <w:lang w:val="es-ES"/>
         </w:rPr>
-        <w:t>VW_MostrarArticulosStockBaj</w:t>
-      </w:r>
-      <w:r>
-        <w:rPr>
-          <w:rFonts w:cs="Consolas"/>
-          <w:b/>
-          <w:bCs/>
-          <w:color w:val="000000"/>
-          <w:lang w:val="es-ES"/>
-        </w:rPr>
-        <w:t>o</w:t>
+        <w:t>VW_MostrarArticulosStockBajo</w:t>
       </w:r>
       <w:proofErr w:type="spellEnd"/>
       <w:r>
@@ -3650,14 +3605,6 @@
         </w:tc>
       </w:tr>
     </w:tbl>
-    <w:p>
-      <w:pPr>
-        <w:ind w:firstLine="0"/>
-        <w:rPr>
-          <w:lang w:val="en-US"/>
-        </w:rPr>
-      </w:pPr>
-    </w:p>
     <w:p>
       <w:pPr>
         <w:pStyle w:val="Ttulo3"/>
@@ -3953,28 +3900,7 @@
                 <w:lang w:val="en-US"/>
               </w:rPr>
               <w:tab/>
-            </w:r>
-            <w:proofErr w:type="gramStart"/>
-            <w:r>
-              <w:rPr>
-                <w:rFonts w:ascii="Consolas" w:hAnsi="Consolas" w:cs="Consolas"/>
-                <w:color w:val="000000"/>
-                <w:sz w:val="16"/>
-                <w:szCs w:val="16"/>
-                <w:lang w:val="en-US"/>
-              </w:rPr>
-              <w:t>@idMarca</w:t>
-            </w:r>
-            <w:proofErr w:type="gramEnd"/>
-            <w:r>
-              <w:rPr>
-                <w:rFonts w:ascii="Consolas" w:hAnsi="Consolas" w:cs="Consolas"/>
-                <w:color w:val="000000"/>
-                <w:sz w:val="16"/>
-                <w:szCs w:val="16"/>
-                <w:lang w:val="en-US"/>
-              </w:rPr>
-              <w:t xml:space="preserve"> </w:t>
+              <w:t xml:space="preserve">@idMarca </w:t>
             </w:r>
             <w:r>
               <w:rPr>
@@ -4032,28 +3958,7 @@
                 <w:lang w:val="en-US"/>
               </w:rPr>
               <w:tab/>
-            </w:r>
-            <w:proofErr w:type="gramStart"/>
-            <w:r>
-              <w:rPr>
-                <w:rFonts w:ascii="Consolas" w:hAnsi="Consolas" w:cs="Consolas"/>
-                <w:color w:val="000000"/>
-                <w:sz w:val="16"/>
-                <w:szCs w:val="16"/>
-                <w:lang w:val="en-US"/>
-              </w:rPr>
-              <w:t>@precioArticulo</w:t>
-            </w:r>
-            <w:proofErr w:type="gramEnd"/>
-            <w:r>
-              <w:rPr>
-                <w:rFonts w:ascii="Consolas" w:hAnsi="Consolas" w:cs="Consolas"/>
-                <w:color w:val="000000"/>
-                <w:sz w:val="16"/>
-                <w:szCs w:val="16"/>
-                <w:lang w:val="en-US"/>
-              </w:rPr>
-              <w:t xml:space="preserve"> </w:t>
+              <w:t xml:space="preserve">@precioArticulo </w:t>
             </w:r>
             <w:r>
               <w:rPr>
@@ -4331,7 +4236,7 @@
                 <w:color w:val="000000"/>
                 <w:sz w:val="16"/>
                 <w:szCs w:val="16"/>
-                <w:lang w:val="en-US"/>
+                <w:lang w:val="es-AR"/>
               </w:rPr>
             </w:pPr>
             <w:r>
@@ -4364,14 +4269,13 @@
               </w:rPr>
               <w:tab/>
             </w:r>
-            <w:proofErr w:type="gramStart"/>
-            <w:r>
-              <w:rPr>
-                <w:rFonts w:ascii="Consolas" w:hAnsi="Consolas" w:cs="Consolas"/>
-                <w:color w:val="0000FF"/>
-                <w:sz w:val="16"/>
-                <w:szCs w:val="16"/>
-                <w:lang w:val="en-US"/>
+            <w:r>
+              <w:rPr>
+                <w:rFonts w:ascii="Consolas" w:hAnsi="Consolas" w:cs="Consolas"/>
+                <w:color w:val="0000FF"/>
+                <w:sz w:val="16"/>
+                <w:szCs w:val="16"/>
+                <w:lang w:val="es-AR"/>
               </w:rPr>
               <w:t xml:space="preserve">IF </w:t>
             </w:r>
@@ -4381,7 +4285,7 @@
                 <w:color w:val="808080"/>
                 <w:sz w:val="16"/>
                 <w:szCs w:val="16"/>
-                <w:lang w:val="en-US"/>
+                <w:lang w:val="es-AR"/>
               </w:rPr>
               <w:t>(</w:t>
             </w:r>
@@ -4391,28 +4295,17 @@
                 <w:color w:val="000000"/>
                 <w:sz w:val="16"/>
                 <w:szCs w:val="16"/>
-                <w:lang w:val="en-US"/>
-              </w:rPr>
-              <w:t>@</w:t>
-            </w:r>
-            <w:proofErr w:type="gramEnd"/>
-            <w:r>
-              <w:rPr>
-                <w:rFonts w:ascii="Consolas" w:hAnsi="Consolas" w:cs="Consolas"/>
-                <w:color w:val="000000"/>
-                <w:sz w:val="16"/>
-                <w:szCs w:val="16"/>
-                <w:lang w:val="en-US"/>
-              </w:rPr>
-              <w:t xml:space="preserve">precioArticulo </w:t>
-            </w:r>
-            <w:r>
-              <w:rPr>
-                <w:rFonts w:ascii="Consolas" w:hAnsi="Consolas" w:cs="Consolas"/>
-                <w:color w:val="808080"/>
-                <w:sz w:val="16"/>
-                <w:szCs w:val="16"/>
-                <w:lang w:val="en-US"/>
+                <w:lang w:val="es-AR"/>
+              </w:rPr>
+              <w:t xml:space="preserve">@precioArticulo </w:t>
+            </w:r>
+            <w:r>
+              <w:rPr>
+                <w:rFonts w:ascii="Consolas" w:hAnsi="Consolas" w:cs="Consolas"/>
+                <w:color w:val="808080"/>
+                <w:sz w:val="16"/>
+                <w:szCs w:val="16"/>
+                <w:lang w:val="es-AR"/>
               </w:rPr>
               <w:t>&lt;</w:t>
             </w:r>
@@ -4422,7 +4315,7 @@
                 <w:color w:val="000000"/>
                 <w:sz w:val="16"/>
                 <w:szCs w:val="16"/>
-                <w:lang w:val="en-US"/>
+                <w:lang w:val="es-AR"/>
               </w:rPr>
               <w:t xml:space="preserve"> 0</w:t>
             </w:r>
@@ -4432,7 +4325,7 @@
                 <w:color w:val="808080"/>
                 <w:sz w:val="16"/>
                 <w:szCs w:val="16"/>
-                <w:lang w:val="en-US"/>
+                <w:lang w:val="es-AR"/>
               </w:rPr>
               <w:t>)</w:t>
             </w:r>
@@ -4442,7 +4335,7 @@
                 <w:color w:val="000000"/>
                 <w:sz w:val="16"/>
                 <w:szCs w:val="16"/>
-                <w:lang w:val="en-US"/>
+                <w:lang w:val="es-AR"/>
               </w:rPr>
               <w:t xml:space="preserve"> </w:t>
             </w:r>
@@ -4452,7 +4345,7 @@
                 <w:color w:val="0000FF"/>
                 <w:sz w:val="16"/>
                 <w:szCs w:val="16"/>
-                <w:lang w:val="en-US"/>
+                <w:lang w:val="es-AR"/>
               </w:rPr>
               <w:t>BEGIN</w:t>
             </w:r>
@@ -4479,37 +4372,37 @@
                 <w:color w:val="000000"/>
                 <w:sz w:val="16"/>
                 <w:szCs w:val="16"/>
-                <w:lang w:val="en-US"/>
-              </w:rPr>
-              <w:tab/>
-            </w:r>
-            <w:r>
-              <w:rPr>
-                <w:rFonts w:ascii="Consolas" w:hAnsi="Consolas" w:cs="Consolas"/>
-                <w:color w:val="000000"/>
-                <w:sz w:val="16"/>
-                <w:szCs w:val="16"/>
-                <w:lang w:val="en-US"/>
-              </w:rPr>
-              <w:tab/>
-            </w:r>
-            <w:r>
-              <w:rPr>
-                <w:rFonts w:ascii="Consolas" w:hAnsi="Consolas" w:cs="Consolas"/>
-                <w:color w:val="000000"/>
-                <w:sz w:val="16"/>
-                <w:szCs w:val="16"/>
-                <w:lang w:val="en-US"/>
-              </w:rPr>
-              <w:tab/>
-            </w:r>
-            <w:r>
-              <w:rPr>
-                <w:rFonts w:ascii="Consolas" w:hAnsi="Consolas" w:cs="Consolas"/>
-                <w:color w:val="000000"/>
-                <w:sz w:val="16"/>
-                <w:szCs w:val="16"/>
-                <w:lang w:val="en-US"/>
+                <w:lang w:val="es-AR"/>
+              </w:rPr>
+              <w:tab/>
+            </w:r>
+            <w:r>
+              <w:rPr>
+                <w:rFonts w:ascii="Consolas" w:hAnsi="Consolas" w:cs="Consolas"/>
+                <w:color w:val="000000"/>
+                <w:sz w:val="16"/>
+                <w:szCs w:val="16"/>
+                <w:lang w:val="es-AR"/>
+              </w:rPr>
+              <w:tab/>
+            </w:r>
+            <w:r>
+              <w:rPr>
+                <w:rFonts w:ascii="Consolas" w:hAnsi="Consolas" w:cs="Consolas"/>
+                <w:color w:val="000000"/>
+                <w:sz w:val="16"/>
+                <w:szCs w:val="16"/>
+                <w:lang w:val="es-AR"/>
+              </w:rPr>
+              <w:tab/>
+            </w:r>
+            <w:r>
+              <w:rPr>
+                <w:rFonts w:ascii="Consolas" w:hAnsi="Consolas" w:cs="Consolas"/>
+                <w:color w:val="000000"/>
+                <w:sz w:val="16"/>
+                <w:szCs w:val="16"/>
+                <w:lang w:val="es-AR"/>
               </w:rPr>
               <w:tab/>
             </w:r>
@@ -4699,7 +4592,6 @@
               </w:rPr>
               <w:tab/>
             </w:r>
-            <w:proofErr w:type="gramStart"/>
             <w:r>
               <w:rPr>
                 <w:rFonts w:ascii="Consolas" w:hAnsi="Consolas" w:cs="Consolas"/>
@@ -4718,18 +4610,7 @@
                 <w:szCs w:val="16"/>
                 <w:lang w:val="en-US"/>
               </w:rPr>
-              <w:t xml:space="preserve"> @</w:t>
-            </w:r>
-            <w:proofErr w:type="gramEnd"/>
-            <w:r>
-              <w:rPr>
-                <w:rFonts w:ascii="Consolas" w:hAnsi="Consolas" w:cs="Consolas"/>
-                <w:color w:val="000000"/>
-                <w:sz w:val="16"/>
-                <w:szCs w:val="16"/>
-                <w:lang w:val="en-US"/>
-              </w:rPr>
-              <w:t xml:space="preserve">marcaID </w:t>
+              <w:t xml:space="preserve"> @marcaID </w:t>
             </w:r>
             <w:r>
               <w:rPr>
@@ -4788,7 +4669,6 @@
               </w:rPr>
               <w:tab/>
             </w:r>
-            <w:proofErr w:type="gramStart"/>
             <w:r>
               <w:rPr>
                 <w:rFonts w:ascii="Consolas" w:hAnsi="Consolas" w:cs="Consolas"/>
@@ -4807,18 +4687,7 @@
                 <w:szCs w:val="16"/>
                 <w:lang w:val="en-US"/>
               </w:rPr>
-              <w:t xml:space="preserve"> @</w:t>
-            </w:r>
-            <w:proofErr w:type="gramEnd"/>
-            <w:r>
-              <w:rPr>
-                <w:rFonts w:ascii="Consolas" w:hAnsi="Consolas" w:cs="Consolas"/>
-                <w:color w:val="000000"/>
-                <w:sz w:val="16"/>
-                <w:szCs w:val="16"/>
-                <w:lang w:val="en-US"/>
-              </w:rPr>
-              <w:t xml:space="preserve">marcaID </w:t>
+              <w:t xml:space="preserve"> @marcaID </w:t>
             </w:r>
             <w:r>
               <w:rPr>
@@ -4838,18 +4707,7 @@
                 <w:szCs w:val="16"/>
                 <w:lang w:val="en-US"/>
               </w:rPr>
-              <w:t xml:space="preserve"> </w:t>
-            </w:r>
-            <w:proofErr w:type="gramStart"/>
-            <w:r>
-              <w:rPr>
-                <w:rFonts w:ascii="Consolas" w:hAnsi="Consolas" w:cs="Consolas"/>
-                <w:color w:val="000000"/>
-                <w:sz w:val="16"/>
-                <w:szCs w:val="16"/>
-                <w:lang w:val="en-US"/>
-              </w:rPr>
-              <w:t>0</w:t>
+              <w:t xml:space="preserve"> 0</w:t>
             </w:r>
             <w:r>
               <w:rPr>
@@ -4861,7 +4719,6 @@
               </w:rPr>
               <w:t>;</w:t>
             </w:r>
-            <w:proofErr w:type="gramEnd"/>
           </w:p>
           <w:p>
             <w:pPr>
@@ -5068,18 +4925,7 @@
                 <w:szCs w:val="16"/>
                 <w:lang w:val="en-US"/>
               </w:rPr>
-              <w:t xml:space="preserve"> @</w:t>
-            </w:r>
-            <w:proofErr w:type="gramStart"/>
-            <w:r>
-              <w:rPr>
-                <w:rFonts w:ascii="Consolas" w:hAnsi="Consolas" w:cs="Consolas"/>
-                <w:color w:val="000000"/>
-                <w:sz w:val="16"/>
-                <w:szCs w:val="16"/>
-                <w:lang w:val="en-US"/>
-              </w:rPr>
-              <w:t>idMarca</w:t>
+              <w:t xml:space="preserve"> @idMarca</w:t>
             </w:r>
             <w:r>
               <w:rPr>
@@ -5091,7 +4937,6 @@
               </w:rPr>
               <w:t>;</w:t>
             </w:r>
-            <w:proofErr w:type="gramEnd"/>
           </w:p>
           <w:p>
             <w:pPr>
@@ -5446,7 +5291,7 @@
                 <w:color w:val="000000"/>
                 <w:sz w:val="16"/>
                 <w:szCs w:val="16"/>
-                <w:lang w:val="en-US"/>
+                <w:lang w:val="es-AR"/>
               </w:rPr>
             </w:pPr>
             <w:r>
@@ -5485,7 +5330,7 @@
                 <w:color w:val="0000FF"/>
                 <w:sz w:val="16"/>
                 <w:szCs w:val="16"/>
-                <w:lang w:val="en-US"/>
+                <w:lang w:val="es-AR"/>
               </w:rPr>
               <w:t>INSERT</w:t>
             </w:r>
@@ -5495,7 +5340,7 @@
                 <w:color w:val="000000"/>
                 <w:sz w:val="16"/>
                 <w:szCs w:val="16"/>
-                <w:lang w:val="en-US"/>
+                <w:lang w:val="es-AR"/>
               </w:rPr>
               <w:t xml:space="preserve"> </w:t>
             </w:r>
@@ -5505,7 +5350,7 @@
                 <w:color w:val="0000FF"/>
                 <w:sz w:val="16"/>
                 <w:szCs w:val="16"/>
-                <w:lang w:val="en-US"/>
+                <w:lang w:val="es-AR"/>
               </w:rPr>
               <w:t>INTO</w:t>
             </w:r>
@@ -5515,7 +5360,7 @@
                 <w:color w:val="000000"/>
                 <w:sz w:val="16"/>
                 <w:szCs w:val="16"/>
-                <w:lang w:val="en-US"/>
+                <w:lang w:val="es-AR"/>
               </w:rPr>
               <w:t xml:space="preserve"> </w:t>
             </w:r>
@@ -5526,7 +5371,7 @@
                 <w:color w:val="000000"/>
                 <w:sz w:val="16"/>
                 <w:szCs w:val="16"/>
-                <w:lang w:val="en-US"/>
+                <w:lang w:val="es-AR"/>
               </w:rPr>
               <w:t>Articulos</w:t>
             </w:r>
@@ -5537,7 +5382,7 @@
                 <w:color w:val="0000FF"/>
                 <w:sz w:val="16"/>
                 <w:szCs w:val="16"/>
-                <w:lang w:val="en-US"/>
+                <w:lang w:val="es-AR"/>
               </w:rPr>
               <w:t xml:space="preserve"> </w:t>
             </w:r>
@@ -5547,7 +5392,7 @@
                 <w:color w:val="808080"/>
                 <w:sz w:val="16"/>
                 <w:szCs w:val="16"/>
-                <w:lang w:val="en-US"/>
+                <w:lang w:val="es-AR"/>
               </w:rPr>
               <w:t>(</w:t>
             </w:r>
@@ -5557,7 +5402,7 @@
                 <w:color w:val="000000"/>
                 <w:sz w:val="16"/>
                 <w:szCs w:val="16"/>
-                <w:lang w:val="en-US"/>
+                <w:lang w:val="es-AR"/>
               </w:rPr>
               <w:t>Nombre</w:t>
             </w:r>
@@ -5567,7 +5412,7 @@
                 <w:color w:val="808080"/>
                 <w:sz w:val="16"/>
                 <w:szCs w:val="16"/>
-                <w:lang w:val="en-US"/>
+                <w:lang w:val="es-AR"/>
               </w:rPr>
               <w:t>,</w:t>
             </w:r>
@@ -5577,7 +5422,7 @@
                 <w:color w:val="000000"/>
                 <w:sz w:val="16"/>
                 <w:szCs w:val="16"/>
-                <w:lang w:val="en-US"/>
+                <w:lang w:val="es-AR"/>
               </w:rPr>
               <w:t xml:space="preserve"> </w:t>
             </w:r>
@@ -5588,7 +5433,7 @@
                 <w:color w:val="000000"/>
                 <w:sz w:val="16"/>
                 <w:szCs w:val="16"/>
-                <w:lang w:val="en-US"/>
+                <w:lang w:val="es-AR"/>
               </w:rPr>
               <w:t>IDMarca</w:t>
             </w:r>
@@ -5599,7 +5444,7 @@
                 <w:color w:val="808080"/>
                 <w:sz w:val="16"/>
                 <w:szCs w:val="16"/>
-                <w:lang w:val="en-US"/>
+                <w:lang w:val="es-AR"/>
               </w:rPr>
               <w:t>,</w:t>
             </w:r>
@@ -5609,49 +5454,37 @@
                 <w:color w:val="000000"/>
                 <w:sz w:val="16"/>
                 <w:szCs w:val="16"/>
-                <w:lang w:val="en-US"/>
+                <w:lang w:val="es-AR"/>
+              </w:rPr>
+              <w:t xml:space="preserve"> Precio</w:t>
+            </w:r>
+            <w:r>
+              <w:rPr>
+                <w:rFonts w:ascii="Consolas" w:hAnsi="Consolas" w:cs="Consolas"/>
+                <w:color w:val="808080"/>
+                <w:sz w:val="16"/>
+                <w:szCs w:val="16"/>
+                <w:lang w:val="es-AR"/>
+              </w:rPr>
+              <w:t>)</w:t>
+            </w:r>
+            <w:r>
+              <w:rPr>
+                <w:rFonts w:ascii="Consolas" w:hAnsi="Consolas" w:cs="Consolas"/>
+                <w:color w:val="000000"/>
+                <w:sz w:val="16"/>
+                <w:szCs w:val="16"/>
+                <w:lang w:val="es-AR"/>
               </w:rPr>
               <w:t xml:space="preserve"> </w:t>
             </w:r>
-            <w:proofErr w:type="spellStart"/>
-            <w:r>
-              <w:rPr>
-                <w:rFonts w:ascii="Consolas" w:hAnsi="Consolas" w:cs="Consolas"/>
-                <w:color w:val="000000"/>
-                <w:sz w:val="16"/>
-                <w:szCs w:val="16"/>
-                <w:lang w:val="en-US"/>
-              </w:rPr>
-              <w:t>Precio</w:t>
-            </w:r>
-            <w:proofErr w:type="spellEnd"/>
-            <w:r>
-              <w:rPr>
-                <w:rFonts w:ascii="Consolas" w:hAnsi="Consolas" w:cs="Consolas"/>
-                <w:color w:val="808080"/>
-                <w:sz w:val="16"/>
-                <w:szCs w:val="16"/>
-                <w:lang w:val="en-US"/>
-              </w:rPr>
-              <w:t>)</w:t>
-            </w:r>
-            <w:r>
-              <w:rPr>
-                <w:rFonts w:ascii="Consolas" w:hAnsi="Consolas" w:cs="Consolas"/>
-                <w:color w:val="000000"/>
-                <w:sz w:val="16"/>
-                <w:szCs w:val="16"/>
-                <w:lang w:val="en-US"/>
-              </w:rPr>
-              <w:t xml:space="preserve"> </w:t>
-            </w:r>
-            <w:r>
-              <w:rPr>
-                <w:rFonts w:ascii="Consolas" w:hAnsi="Consolas" w:cs="Consolas"/>
-                <w:color w:val="0000FF"/>
-                <w:sz w:val="16"/>
-                <w:szCs w:val="16"/>
-                <w:lang w:val="en-US"/>
+            <w:r>
+              <w:rPr>
+                <w:rFonts w:ascii="Consolas" w:hAnsi="Consolas" w:cs="Consolas"/>
+                <w:color w:val="0000FF"/>
+                <w:sz w:val="16"/>
+                <w:szCs w:val="16"/>
+                <w:lang w:val="es-AR"/>
               </w:rPr>
               <w:t xml:space="preserve">VALUES </w:t>
             </w:r>
@@ -5661,7 +5494,7 @@
                 <w:color w:val="808080"/>
                 <w:sz w:val="16"/>
                 <w:szCs w:val="16"/>
-                <w:lang w:val="en-US"/>
+                <w:lang w:val="es-AR"/>
               </w:rPr>
               <w:t>(</w:t>
             </w:r>
@@ -5671,7 +5504,7 @@
                 <w:color w:val="000000"/>
                 <w:sz w:val="16"/>
                 <w:szCs w:val="16"/>
-                <w:lang w:val="en-US"/>
+                <w:lang w:val="es-AR"/>
               </w:rPr>
               <w:t>@nombreArticulo</w:t>
             </w:r>
@@ -5681,7 +5514,7 @@
                 <w:color w:val="808080"/>
                 <w:sz w:val="16"/>
                 <w:szCs w:val="16"/>
-                <w:lang w:val="en-US"/>
+                <w:lang w:val="es-AR"/>
               </w:rPr>
               <w:t>,</w:t>
             </w:r>
@@ -5691,7 +5524,7 @@
                 <w:color w:val="000000"/>
                 <w:sz w:val="16"/>
                 <w:szCs w:val="16"/>
-                <w:lang w:val="en-US"/>
+                <w:lang w:val="es-AR"/>
               </w:rPr>
               <w:t xml:space="preserve"> @idMarca</w:t>
             </w:r>
@@ -5701,7 +5534,7 @@
                 <w:color w:val="808080"/>
                 <w:sz w:val="16"/>
                 <w:szCs w:val="16"/>
-                <w:lang w:val="en-US"/>
+                <w:lang w:val="es-AR"/>
               </w:rPr>
               <w:t>,</w:t>
             </w:r>
@@ -5711,22 +5544,20 @@
                 <w:color w:val="000000"/>
                 <w:sz w:val="16"/>
                 <w:szCs w:val="16"/>
-                <w:lang w:val="en-US"/>
+                <w:lang w:val="es-AR"/>
               </w:rPr>
               <w:t xml:space="preserve"> @precioArticulo</w:t>
             </w:r>
-            <w:proofErr w:type="gramStart"/>
-            <w:r>
-              <w:rPr>
-                <w:rFonts w:ascii="Consolas" w:hAnsi="Consolas" w:cs="Consolas"/>
-                <w:color w:val="808080"/>
-                <w:sz w:val="16"/>
-                <w:szCs w:val="16"/>
-                <w:lang w:val="en-US"/>
+            <w:r>
+              <w:rPr>
+                <w:rFonts w:ascii="Consolas" w:hAnsi="Consolas" w:cs="Consolas"/>
+                <w:color w:val="808080"/>
+                <w:sz w:val="16"/>
+                <w:szCs w:val="16"/>
+                <w:lang w:val="es-AR"/>
               </w:rPr>
               <w:t>);</w:t>
             </w:r>
-            <w:proofErr w:type="gramEnd"/>
           </w:p>
           <w:p>
             <w:pPr>
@@ -5741,7 +5572,7 @@
                 <w:color w:val="000000"/>
                 <w:sz w:val="16"/>
                 <w:szCs w:val="16"/>
-                <w:lang w:val="en-US"/>
+                <w:lang w:val="es-AR"/>
               </w:rPr>
             </w:pPr>
           </w:p>
@@ -5767,27 +5598,27 @@
                 <w:color w:val="000000"/>
                 <w:sz w:val="16"/>
                 <w:szCs w:val="16"/>
-                <w:lang w:val="en-US"/>
-              </w:rPr>
-              <w:tab/>
-            </w:r>
-            <w:r>
-              <w:rPr>
-                <w:rFonts w:ascii="Consolas" w:hAnsi="Consolas" w:cs="Consolas"/>
-                <w:color w:val="000000"/>
-                <w:sz w:val="16"/>
-                <w:szCs w:val="16"/>
-                <w:lang w:val="en-US"/>
-              </w:rPr>
-              <w:tab/>
-            </w:r>
-            <w:r>
-              <w:rPr>
-                <w:rFonts w:ascii="Consolas" w:hAnsi="Consolas" w:cs="Consolas"/>
-                <w:color w:val="000000"/>
-                <w:sz w:val="16"/>
-                <w:szCs w:val="16"/>
-                <w:lang w:val="en-US"/>
+                <w:lang w:val="es-AR"/>
+              </w:rPr>
+              <w:tab/>
+            </w:r>
+            <w:r>
+              <w:rPr>
+                <w:rFonts w:ascii="Consolas" w:hAnsi="Consolas" w:cs="Consolas"/>
+                <w:color w:val="000000"/>
+                <w:sz w:val="16"/>
+                <w:szCs w:val="16"/>
+                <w:lang w:val="es-AR"/>
+              </w:rPr>
+              <w:tab/>
+            </w:r>
+            <w:r>
+              <w:rPr>
+                <w:rFonts w:ascii="Consolas" w:hAnsi="Consolas" w:cs="Consolas"/>
+                <w:color w:val="000000"/>
+                <w:sz w:val="16"/>
+                <w:szCs w:val="16"/>
+                <w:lang w:val="es-AR"/>
               </w:rPr>
               <w:tab/>
             </w:r>
@@ -5831,7 +5662,6 @@
               </w:rPr>
               <w:t xml:space="preserve"> Stock </w:t>
             </w:r>
-            <w:proofErr w:type="gramStart"/>
             <w:r>
               <w:rPr>
                 <w:rFonts w:ascii="Consolas" w:hAnsi="Consolas" w:cs="Consolas"/>
@@ -5860,18 +5690,7 @@
                 <w:szCs w:val="16"/>
                 <w:lang w:val="en-US"/>
               </w:rPr>
-              <w:t>@@</w:t>
-            </w:r>
-            <w:proofErr w:type="gramEnd"/>
-            <w:r>
-              <w:rPr>
-                <w:rFonts w:ascii="Consolas" w:hAnsi="Consolas" w:cs="Consolas"/>
-                <w:color w:val="FF00FF"/>
-                <w:sz w:val="16"/>
-                <w:szCs w:val="16"/>
-                <w:lang w:val="en-US"/>
-              </w:rPr>
-              <w:t>IDENTITY</w:t>
+              <w:t>@@IDENTITY</w:t>
             </w:r>
             <w:r>
               <w:rPr>
@@ -5893,7 +5712,6 @@
               </w:rPr>
               <w:t xml:space="preserve"> 0</w:t>
             </w:r>
-            <w:proofErr w:type="gramStart"/>
             <w:r>
               <w:rPr>
                 <w:rFonts w:ascii="Consolas" w:hAnsi="Consolas" w:cs="Consolas"/>
@@ -5904,7 +5722,6 @@
               </w:rPr>
               <w:t>);</w:t>
             </w:r>
-            <w:proofErr w:type="gramEnd"/>
           </w:p>
           <w:p>
             <w:pPr>
@@ -6009,7 +5826,6 @@
               </w:rPr>
               <w:t xml:space="preserve"> </w:t>
             </w:r>
-            <w:proofErr w:type="gramStart"/>
             <w:r>
               <w:rPr>
                 <w:rFonts w:ascii="Consolas" w:hAnsi="Consolas" w:cs="Consolas"/>
@@ -6030,7 +5846,6 @@
               </w:rPr>
               <w:t>;</w:t>
             </w:r>
-            <w:proofErr w:type="gramEnd"/>
           </w:p>
           <w:p>
             <w:pPr>
@@ -6202,7 +6017,6 @@
               </w:rPr>
               <w:t xml:space="preserve"> </w:t>
             </w:r>
-            <w:proofErr w:type="gramStart"/>
             <w:r>
               <w:rPr>
                 <w:rFonts w:ascii="Consolas" w:hAnsi="Consolas" w:cs="Consolas"/>
@@ -6223,7 +6037,6 @@
               </w:rPr>
               <w:t>;</w:t>
             </w:r>
-            <w:proofErr w:type="gramEnd"/>
           </w:p>
           <w:p>
             <w:pPr>
@@ -6310,9 +6123,19 @@
                 <w:szCs w:val="16"/>
                 <w:lang w:val="en-US"/>
               </w:rPr>
-              <w:t>();</w:t>
+              <w:t>(</w:t>
             </w:r>
             <w:proofErr w:type="gramEnd"/>
+            <w:r>
+              <w:rPr>
+                <w:rFonts w:ascii="Consolas" w:hAnsi="Consolas" w:cs="Consolas"/>
+                <w:color w:val="808080"/>
+                <w:sz w:val="16"/>
+                <w:szCs w:val="16"/>
+                <w:lang w:val="en-US"/>
+              </w:rPr>
+              <w:t>);</w:t>
+            </w:r>
           </w:p>
           <w:p>
             <w:pPr>
@@ -6418,6 +6241,7 @@
       <w:bookmarkStart w:id="7" w:name="_egh89jb8cj62" w:colFirst="0" w:colLast="0"/>
       <w:bookmarkEnd w:id="7"/>
       <w:r>
+        <w:lastRenderedPageBreak/>
         <w:t>Procedimiento Almacenado 2</w:t>
       </w:r>
     </w:p>
@@ -6485,25 +6309,7 @@
           <w:color w:val="000000"/>
           <w:lang w:val="es-AR"/>
         </w:rPr>
-        <w:t xml:space="preserve"> de un artículo que forma parte de una venta en cuestión. Se le deberá proporcionar el ID de Venta al cual se va a agregar el artículo, el ID del artículo que forma parte de esa venta, y la cantidad que forma parte de </w:t>
-      </w:r>
-      <w:proofErr w:type="gramStart"/>
-      <w:r>
-        <w:rPr>
-          <w:rFonts w:cs="Consolas"/>
-          <w:color w:val="000000"/>
-          <w:lang w:val="es-AR"/>
-        </w:rPr>
-        <w:t>la misma</w:t>
-      </w:r>
-      <w:proofErr w:type="gramEnd"/>
-      <w:r>
-        <w:rPr>
-          <w:rFonts w:cs="Consolas"/>
-          <w:color w:val="000000"/>
-          <w:lang w:val="es-AR"/>
-        </w:rPr>
-        <w:t>.</w:t>
+        <w:t xml:space="preserve"> de un artículo que forma parte de una venta en cuestión. Se le deberá proporcionar el ID de Venta al cual se va a agregar el artículo, el ID del artículo que forma parte de esa venta, y la cantidad que forma parte de la misma.</w:t>
       </w:r>
     </w:p>
     <w:p>
@@ -6517,22 +6323,7 @@
         <w:rPr>
           <w:lang w:val="es-AR"/>
         </w:rPr>
-        <w:lastRenderedPageBreak/>
-        <w:t xml:space="preserve">El procedimiento valida que el ID de venta esté registrado en la base de datos (Por lo que antes, se crea una venta, y luego se cargan los artículos que forman parte de </w:t>
-      </w:r>
-      <w:proofErr w:type="gramStart"/>
-      <w:r>
-        <w:rPr>
-          <w:lang w:val="es-AR"/>
-        </w:rPr>
-        <w:t>la misma</w:t>
-      </w:r>
-      <w:proofErr w:type="gramEnd"/>
-      <w:r>
-        <w:rPr>
-          <w:lang w:val="es-AR"/>
-        </w:rPr>
-        <w:t>)</w:t>
+        <w:t>El procedimiento valida que el ID de venta esté registrado en la base de datos (Por lo que antes, se crea una venta, y luego se cargan los artículos que forman parte de la misma)</w:t>
       </w:r>
     </w:p>
     <w:p>
@@ -6616,21 +6407,7 @@
         <w:rPr>
           <w:lang w:val="es-AR"/>
         </w:rPr>
-        <w:t xml:space="preserve">’ el precio unitario del artículo en el momento de ejecución del procedimiento, porque puede que el precio del artículo cambie, sin embargo, el precio del artículo en el momento de la </w:t>
-      </w:r>
-      <w:proofErr w:type="gramStart"/>
-      <w:r>
-        <w:rPr>
-          <w:lang w:val="es-AR"/>
-        </w:rPr>
-        <w:t>venta,</w:t>
-      </w:r>
-      <w:proofErr w:type="gramEnd"/>
-      <w:r>
-        <w:rPr>
-          <w:lang w:val="es-AR"/>
-        </w:rPr>
-        <w:t xml:space="preserve"> era otro, por eso se guarda este último.</w:t>
+        <w:t>’ el precio unitario del artículo en el momento de ejecución del procedimiento, porque puede que el precio del artículo cambie, sin embargo, el precio del artículo en el momento de la venta, era otro, por eso se guarda este último.</w:t>
       </w:r>
     </w:p>
     <w:tbl>
@@ -6806,28 +6583,7 @@
                 <w:lang w:val="en-US"/>
               </w:rPr>
               <w:tab/>
-            </w:r>
-            <w:proofErr w:type="gramStart"/>
-            <w:r>
-              <w:rPr>
-                <w:rFonts w:ascii="Consolas" w:hAnsi="Consolas" w:cs="Consolas"/>
-                <w:color w:val="000000"/>
-                <w:sz w:val="16"/>
-                <w:szCs w:val="16"/>
-                <w:lang w:val="en-US"/>
-              </w:rPr>
-              <w:t>@idArticulo</w:t>
-            </w:r>
-            <w:proofErr w:type="gramEnd"/>
-            <w:r>
-              <w:rPr>
-                <w:rFonts w:ascii="Consolas" w:hAnsi="Consolas" w:cs="Consolas"/>
-                <w:color w:val="000000"/>
-                <w:sz w:val="16"/>
-                <w:szCs w:val="16"/>
-                <w:lang w:val="en-US"/>
-              </w:rPr>
-              <w:t xml:space="preserve"> </w:t>
+              <w:t xml:space="preserve">@idArticulo </w:t>
             </w:r>
             <w:r>
               <w:rPr>
@@ -8874,18 +8630,7 @@
                 <w:szCs w:val="16"/>
                 <w:lang w:val="en-US"/>
               </w:rPr>
-              <w:t xml:space="preserve"> @</w:t>
-            </w:r>
-            <w:proofErr w:type="gramStart"/>
-            <w:r>
-              <w:rPr>
-                <w:rFonts w:ascii="Consolas" w:hAnsi="Consolas" w:cs="Consolas"/>
-                <w:color w:val="000000"/>
-                <w:sz w:val="16"/>
-                <w:szCs w:val="16"/>
-                <w:lang w:val="en-US"/>
-              </w:rPr>
-              <w:t>idArticulo</w:t>
+              <w:t xml:space="preserve"> @idArticulo</w:t>
             </w:r>
             <w:r>
               <w:rPr>
@@ -8897,7 +8642,6 @@
               </w:rPr>
               <w:t>;</w:t>
             </w:r>
-            <w:proofErr w:type="gramEnd"/>
           </w:p>
           <w:p>
             <w:pPr>
@@ -8944,7 +8688,6 @@
               </w:rPr>
               <w:tab/>
             </w:r>
-            <w:proofErr w:type="gramStart"/>
             <w:r>
               <w:rPr>
                 <w:rFonts w:ascii="Consolas" w:hAnsi="Consolas" w:cs="Consolas"/>
@@ -8973,18 +8716,7 @@
                 <w:szCs w:val="16"/>
                 <w:lang w:val="en-US"/>
               </w:rPr>
-              <w:t>@</w:t>
-            </w:r>
-            <w:proofErr w:type="gramEnd"/>
-            <w:r>
-              <w:rPr>
-                <w:rFonts w:ascii="Consolas" w:hAnsi="Consolas" w:cs="Consolas"/>
-                <w:color w:val="000000"/>
-                <w:sz w:val="16"/>
-                <w:szCs w:val="16"/>
-                <w:lang w:val="en-US"/>
-              </w:rPr>
-              <w:t xml:space="preserve">precioUnitario </w:t>
+              <w:t xml:space="preserve">@precioUnitario </w:t>
             </w:r>
             <w:r>
               <w:rPr>
@@ -9371,7 +9103,7 @@
                 <w:color w:val="000000"/>
                 <w:sz w:val="16"/>
                 <w:szCs w:val="16"/>
-                <w:lang w:val="en-US"/>
+                <w:lang w:val="es-AR"/>
               </w:rPr>
             </w:pPr>
             <w:r>
@@ -9404,14 +9136,13 @@
               </w:rPr>
               <w:tab/>
             </w:r>
-            <w:proofErr w:type="gramStart"/>
-            <w:r>
-              <w:rPr>
-                <w:rFonts w:ascii="Consolas" w:hAnsi="Consolas" w:cs="Consolas"/>
-                <w:color w:val="0000FF"/>
-                <w:sz w:val="16"/>
-                <w:szCs w:val="16"/>
-                <w:lang w:val="en-US"/>
+            <w:r>
+              <w:rPr>
+                <w:rFonts w:ascii="Consolas" w:hAnsi="Consolas" w:cs="Consolas"/>
+                <w:color w:val="0000FF"/>
+                <w:sz w:val="16"/>
+                <w:szCs w:val="16"/>
+                <w:lang w:val="es-AR"/>
               </w:rPr>
               <w:t xml:space="preserve">IF </w:t>
             </w:r>
@@ -9421,7 +9152,7 @@
                 <w:color w:val="808080"/>
                 <w:sz w:val="16"/>
                 <w:szCs w:val="16"/>
-                <w:lang w:val="en-US"/>
+                <w:lang w:val="es-AR"/>
               </w:rPr>
               <w:t>(</w:t>
             </w:r>
@@ -9431,28 +9162,17 @@
                 <w:color w:val="000000"/>
                 <w:sz w:val="16"/>
                 <w:szCs w:val="16"/>
-                <w:lang w:val="en-US"/>
-              </w:rPr>
-              <w:t>@</w:t>
-            </w:r>
-            <w:proofErr w:type="gramEnd"/>
-            <w:r>
-              <w:rPr>
-                <w:rFonts w:ascii="Consolas" w:hAnsi="Consolas" w:cs="Consolas"/>
-                <w:color w:val="000000"/>
-                <w:sz w:val="16"/>
-                <w:szCs w:val="16"/>
-                <w:lang w:val="en-US"/>
-              </w:rPr>
-              <w:t xml:space="preserve">cantidad </w:t>
-            </w:r>
-            <w:r>
-              <w:rPr>
-                <w:rFonts w:ascii="Consolas" w:hAnsi="Consolas" w:cs="Consolas"/>
-                <w:color w:val="808080"/>
-                <w:sz w:val="16"/>
-                <w:szCs w:val="16"/>
-                <w:lang w:val="en-US"/>
+                <w:lang w:val="es-AR"/>
+              </w:rPr>
+              <w:t xml:space="preserve">@cantidad </w:t>
+            </w:r>
+            <w:r>
+              <w:rPr>
+                <w:rFonts w:ascii="Consolas" w:hAnsi="Consolas" w:cs="Consolas"/>
+                <w:color w:val="808080"/>
+                <w:sz w:val="16"/>
+                <w:szCs w:val="16"/>
+                <w:lang w:val="es-AR"/>
               </w:rPr>
               <w:t>&lt;</w:t>
             </w:r>
@@ -9462,7 +9182,7 @@
                 <w:color w:val="000000"/>
                 <w:sz w:val="16"/>
                 <w:szCs w:val="16"/>
-                <w:lang w:val="en-US"/>
+                <w:lang w:val="es-AR"/>
               </w:rPr>
               <w:t xml:space="preserve"> 0</w:t>
             </w:r>
@@ -9472,7 +9192,7 @@
                 <w:color w:val="808080"/>
                 <w:sz w:val="16"/>
                 <w:szCs w:val="16"/>
-                <w:lang w:val="en-US"/>
+                <w:lang w:val="es-AR"/>
               </w:rPr>
               <w:t>)</w:t>
             </w:r>
@@ -9482,7 +9202,7 @@
                 <w:color w:val="000000"/>
                 <w:sz w:val="16"/>
                 <w:szCs w:val="16"/>
-                <w:lang w:val="en-US"/>
+                <w:lang w:val="es-AR"/>
               </w:rPr>
               <w:t xml:space="preserve"> </w:t>
             </w:r>
@@ -9492,7 +9212,7 @@
                 <w:color w:val="0000FF"/>
                 <w:sz w:val="16"/>
                 <w:szCs w:val="16"/>
-                <w:lang w:val="en-US"/>
+                <w:lang w:val="es-AR"/>
               </w:rPr>
               <w:t>BEGIN</w:t>
             </w:r>
@@ -9518,37 +9238,37 @@
                 <w:color w:val="000000"/>
                 <w:sz w:val="16"/>
                 <w:szCs w:val="16"/>
-                <w:lang w:val="en-US"/>
-              </w:rPr>
-              <w:tab/>
-            </w:r>
-            <w:r>
-              <w:rPr>
-                <w:rFonts w:ascii="Consolas" w:hAnsi="Consolas" w:cs="Consolas"/>
-                <w:color w:val="000000"/>
-                <w:sz w:val="16"/>
-                <w:szCs w:val="16"/>
-                <w:lang w:val="en-US"/>
-              </w:rPr>
-              <w:tab/>
-            </w:r>
-            <w:r>
-              <w:rPr>
-                <w:rFonts w:ascii="Consolas" w:hAnsi="Consolas" w:cs="Consolas"/>
-                <w:color w:val="000000"/>
-                <w:sz w:val="16"/>
-                <w:szCs w:val="16"/>
-                <w:lang w:val="en-US"/>
-              </w:rPr>
-              <w:tab/>
-            </w:r>
-            <w:r>
-              <w:rPr>
-                <w:rFonts w:ascii="Consolas" w:hAnsi="Consolas" w:cs="Consolas"/>
-                <w:color w:val="000000"/>
-                <w:sz w:val="16"/>
-                <w:szCs w:val="16"/>
-                <w:lang w:val="en-US"/>
+                <w:lang w:val="es-AR"/>
+              </w:rPr>
+              <w:tab/>
+            </w:r>
+            <w:r>
+              <w:rPr>
+                <w:rFonts w:ascii="Consolas" w:hAnsi="Consolas" w:cs="Consolas"/>
+                <w:color w:val="000000"/>
+                <w:sz w:val="16"/>
+                <w:szCs w:val="16"/>
+                <w:lang w:val="es-AR"/>
+              </w:rPr>
+              <w:tab/>
+            </w:r>
+            <w:r>
+              <w:rPr>
+                <w:rFonts w:ascii="Consolas" w:hAnsi="Consolas" w:cs="Consolas"/>
+                <w:color w:val="000000"/>
+                <w:sz w:val="16"/>
+                <w:szCs w:val="16"/>
+                <w:lang w:val="es-AR"/>
+              </w:rPr>
+              <w:tab/>
+            </w:r>
+            <w:r>
+              <w:rPr>
+                <w:rFonts w:ascii="Consolas" w:hAnsi="Consolas" w:cs="Consolas"/>
+                <w:color w:val="000000"/>
+                <w:sz w:val="16"/>
+                <w:szCs w:val="16"/>
+                <w:lang w:val="es-AR"/>
               </w:rPr>
               <w:tab/>
             </w:r>
@@ -9860,7 +9580,6 @@
               </w:rPr>
               <w:tab/>
             </w:r>
-            <w:proofErr w:type="gramStart"/>
             <w:r>
               <w:rPr>
                 <w:rFonts w:ascii="Consolas" w:hAnsi="Consolas" w:cs="Consolas"/>
@@ -9879,20 +9598,8 @@
                 <w:szCs w:val="16"/>
                 <w:lang w:val="en-US"/>
               </w:rPr>
-              <w:t xml:space="preserve"> @</w:t>
-            </w:r>
-            <w:proofErr w:type="gramEnd"/>
-            <w:r>
-              <w:rPr>
-                <w:rFonts w:ascii="Consolas" w:hAnsi="Consolas" w:cs="Consolas"/>
-                <w:color w:val="000000"/>
-                <w:sz w:val="16"/>
-                <w:szCs w:val="16"/>
-                <w:lang w:val="en-US"/>
-              </w:rPr>
-              <w:t xml:space="preserve">stockActual </w:t>
-            </w:r>
-            <w:proofErr w:type="gramStart"/>
+              <w:t xml:space="preserve"> @stockActual </w:t>
+            </w:r>
             <w:r>
               <w:rPr>
                 <w:rFonts w:ascii="Consolas" w:hAnsi="Consolas" w:cs="Consolas"/>
@@ -9913,7 +9620,6 @@
               </w:rPr>
               <w:t>;</w:t>
             </w:r>
-            <w:proofErr w:type="gramEnd"/>
           </w:p>
           <w:p>
             <w:pPr>
@@ -10102,18 +9808,7 @@
                 <w:szCs w:val="16"/>
                 <w:lang w:val="en-US"/>
               </w:rPr>
-              <w:t xml:space="preserve"> @</w:t>
-            </w:r>
-            <w:proofErr w:type="gramStart"/>
-            <w:r>
-              <w:rPr>
-                <w:rFonts w:ascii="Consolas" w:hAnsi="Consolas" w:cs="Consolas"/>
-                <w:color w:val="000000"/>
-                <w:sz w:val="16"/>
-                <w:szCs w:val="16"/>
-                <w:lang w:val="en-US"/>
-              </w:rPr>
-              <w:t>idArticulo</w:t>
+              <w:t xml:space="preserve"> @idArticulo</w:t>
             </w:r>
             <w:r>
               <w:rPr>
@@ -10125,7 +9820,6 @@
               </w:rPr>
               <w:t>;</w:t>
             </w:r>
-            <w:proofErr w:type="gramEnd"/>
           </w:p>
           <w:p>
             <w:pPr>
@@ -10276,6 +9970,7 @@
                 <w:szCs w:val="16"/>
                 <w:lang w:val="es-AR"/>
               </w:rPr>
+              <w:lastRenderedPageBreak/>
               <w:tab/>
             </w:r>
             <w:r>
@@ -10792,18 +10487,7 @@
                 <w:szCs w:val="16"/>
                 <w:lang w:val="en-US"/>
               </w:rPr>
-              <w:t xml:space="preserve"> @</w:t>
-            </w:r>
-            <w:proofErr w:type="gramStart"/>
-            <w:r>
-              <w:rPr>
-                <w:rFonts w:ascii="Consolas" w:hAnsi="Consolas" w:cs="Consolas"/>
-                <w:color w:val="000000"/>
-                <w:sz w:val="16"/>
-                <w:szCs w:val="16"/>
-                <w:lang w:val="en-US"/>
-              </w:rPr>
-              <w:t>idArticulo</w:t>
+              <w:t xml:space="preserve"> @idArticulo</w:t>
             </w:r>
             <w:r>
               <w:rPr>
@@ -10815,7 +10499,6 @@
               </w:rPr>
               <w:t>;</w:t>
             </w:r>
-            <w:proofErr w:type="gramEnd"/>
           </w:p>
           <w:p>
             <w:pPr>
@@ -10996,7 +10679,6 @@
               </w:rPr>
               <w:t xml:space="preserve"> </w:t>
             </w:r>
-            <w:proofErr w:type="gramStart"/>
             <w:r>
               <w:rPr>
                 <w:rFonts w:ascii="Consolas" w:hAnsi="Consolas" w:cs="Consolas"/>
@@ -11085,20 +10767,8 @@
                 <w:szCs w:val="16"/>
                 <w:lang w:val="en-US"/>
               </w:rPr>
-              <w:t xml:space="preserve"> @</w:t>
-            </w:r>
-            <w:proofErr w:type="gramEnd"/>
-            <w:r>
-              <w:rPr>
-                <w:rFonts w:ascii="Consolas" w:hAnsi="Consolas" w:cs="Consolas"/>
-                <w:color w:val="000000"/>
-                <w:sz w:val="16"/>
-                <w:szCs w:val="16"/>
-                <w:lang w:val="en-US"/>
-              </w:rPr>
-              <w:t>precioUnitario</w:t>
-            </w:r>
-            <w:proofErr w:type="gramStart"/>
+              <w:t xml:space="preserve"> @precioUnitario</w:t>
+            </w:r>
             <w:r>
               <w:rPr>
                 <w:rFonts w:ascii="Consolas" w:hAnsi="Consolas" w:cs="Consolas"/>
@@ -11109,7 +10779,6 @@
               </w:rPr>
               <w:t>);</w:t>
             </w:r>
-            <w:proofErr w:type="gramEnd"/>
           </w:p>
           <w:p>
             <w:pPr>
@@ -11150,7 +10819,6 @@
                 <w:szCs w:val="16"/>
                 <w:lang w:val="en-US"/>
               </w:rPr>
-              <w:lastRenderedPageBreak/>
               <w:tab/>
             </w:r>
             <w:r>
@@ -11183,7 +10851,6 @@
               </w:rPr>
               <w:t xml:space="preserve"> </w:t>
             </w:r>
-            <w:proofErr w:type="gramStart"/>
             <w:r>
               <w:rPr>
                 <w:rFonts w:ascii="Consolas" w:hAnsi="Consolas" w:cs="Consolas"/>
@@ -11204,7 +10871,6 @@
               </w:rPr>
               <w:t>;</w:t>
             </w:r>
-            <w:proofErr w:type="gramEnd"/>
           </w:p>
           <w:p>
             <w:pPr>
@@ -11373,7 +11039,6 @@
               </w:rPr>
               <w:t xml:space="preserve"> </w:t>
             </w:r>
-            <w:proofErr w:type="gramStart"/>
             <w:r>
               <w:rPr>
                 <w:rFonts w:ascii="Consolas" w:hAnsi="Consolas" w:cs="Consolas"/>
@@ -11394,7 +11059,6 @@
               </w:rPr>
               <w:t>;</w:t>
             </w:r>
-            <w:proofErr w:type="gramEnd"/>
           </w:p>
           <w:p>
             <w:pPr>
@@ -11480,9 +11144,19 @@
                 <w:szCs w:val="16"/>
                 <w:lang w:val="en-US"/>
               </w:rPr>
-              <w:t>();</w:t>
+              <w:t>(</w:t>
             </w:r>
             <w:proofErr w:type="gramEnd"/>
+            <w:r>
+              <w:rPr>
+                <w:rFonts w:ascii="Consolas" w:hAnsi="Consolas" w:cs="Consolas"/>
+                <w:color w:val="808080"/>
+                <w:sz w:val="16"/>
+                <w:szCs w:val="16"/>
+                <w:lang w:val="en-US"/>
+              </w:rPr>
+              <w:t>);</w:t>
+            </w:r>
           </w:p>
           <w:p>
             <w:pPr>
@@ -11782,29 +11456,7 @@
                 <w:szCs w:val="19"/>
                 <w:lang w:val="en-US"/>
               </w:rPr>
-              <w:t xml:space="preserve">    </w:t>
-            </w:r>
-            <w:proofErr w:type="gramStart"/>
-            <w:r>
-              <w:rPr>
-                <w:rFonts w:ascii="Consolas" w:hAnsi="Consolas" w:cs="Consolas"/>
-                <w:color w:val="000000"/>
-                <w:sz w:val="19"/>
-                <w:szCs w:val="19"/>
-                <w:lang w:val="en-US"/>
-              </w:rPr>
-              <w:t>@TipoFactura</w:t>
-            </w:r>
-            <w:proofErr w:type="gramEnd"/>
-            <w:r>
-              <w:rPr>
-                <w:rFonts w:ascii="Consolas" w:hAnsi="Consolas" w:cs="Consolas"/>
-                <w:color w:val="000000"/>
-                <w:sz w:val="19"/>
-                <w:szCs w:val="19"/>
-                <w:lang w:val="en-US"/>
-              </w:rPr>
-              <w:t xml:space="preserve"> </w:t>
+              <w:t xml:space="preserve">    @TipoFactura </w:t>
             </w:r>
             <w:proofErr w:type="gramStart"/>
             <w:r>
@@ -12182,36 +11834,46 @@
               </w:rPr>
               <w:tab/>
             </w:r>
+            <w:r>
+              <w:rPr>
+                <w:rFonts w:ascii="Consolas" w:hAnsi="Consolas" w:cs="Consolas"/>
+                <w:color w:val="0000FF"/>
+                <w:sz w:val="19"/>
+                <w:szCs w:val="19"/>
+                <w:lang w:val="en-US"/>
+              </w:rPr>
+              <w:t xml:space="preserve">IF </w:t>
+            </w:r>
+            <w:r>
+              <w:rPr>
+                <w:rFonts w:ascii="Consolas" w:hAnsi="Consolas" w:cs="Consolas"/>
+                <w:color w:val="808080"/>
+                <w:sz w:val="19"/>
+                <w:szCs w:val="19"/>
+                <w:lang w:val="en-US"/>
+              </w:rPr>
+              <w:t>(</w:t>
+            </w:r>
+            <w:r>
+              <w:rPr>
+                <w:rFonts w:ascii="Consolas" w:hAnsi="Consolas" w:cs="Consolas"/>
+                <w:color w:val="000000"/>
+                <w:sz w:val="19"/>
+                <w:szCs w:val="19"/>
+                <w:lang w:val="en-US"/>
+              </w:rPr>
+              <w:t>@</w:t>
+            </w:r>
             <w:proofErr w:type="gramStart"/>
             <w:r>
               <w:rPr>
                 <w:rFonts w:ascii="Consolas" w:hAnsi="Consolas" w:cs="Consolas"/>
-                <w:color w:val="0000FF"/>
-                <w:sz w:val="19"/>
-                <w:szCs w:val="19"/>
-                <w:lang w:val="en-US"/>
-              </w:rPr>
-              <w:t xml:space="preserve">IF </w:t>
-            </w:r>
-            <w:r>
-              <w:rPr>
-                <w:rFonts w:ascii="Consolas" w:hAnsi="Consolas" w:cs="Consolas"/>
-                <w:color w:val="808080"/>
-                <w:sz w:val="19"/>
-                <w:szCs w:val="19"/>
-                <w:lang w:val="en-US"/>
-              </w:rPr>
-              <w:t>(</w:t>
-            </w:r>
-            <w:r>
-              <w:rPr>
-                <w:rFonts w:ascii="Consolas" w:hAnsi="Consolas" w:cs="Consolas"/>
-                <w:color w:val="000000"/>
-                <w:sz w:val="19"/>
-                <w:szCs w:val="19"/>
-                <w:lang w:val="en-US"/>
-              </w:rPr>
-              <w:t xml:space="preserve">@TipoFactura </w:t>
+                <w:color w:val="000000"/>
+                <w:sz w:val="19"/>
+                <w:szCs w:val="19"/>
+                <w:lang w:val="en-US"/>
+              </w:rPr>
+              <w:t xml:space="preserve">TipoFactura </w:t>
             </w:r>
             <w:r>
               <w:rPr>
@@ -12264,26 +11926,36 @@
               </w:rPr>
               <w:t xml:space="preserve"> </w:t>
             </w:r>
+            <w:r>
+              <w:rPr>
+                <w:rFonts w:ascii="Consolas" w:hAnsi="Consolas" w:cs="Consolas"/>
+                <w:color w:val="808080"/>
+                <w:sz w:val="19"/>
+                <w:szCs w:val="19"/>
+                <w:lang w:val="en-US"/>
+              </w:rPr>
+              <w:t>AND</w:t>
+            </w:r>
+            <w:r>
+              <w:rPr>
+                <w:rFonts w:ascii="Consolas" w:hAnsi="Consolas" w:cs="Consolas"/>
+                <w:color w:val="000000"/>
+                <w:sz w:val="19"/>
+                <w:szCs w:val="19"/>
+                <w:lang w:val="en-US"/>
+              </w:rPr>
+              <w:t xml:space="preserve"> @</w:t>
+            </w:r>
             <w:proofErr w:type="gramStart"/>
             <w:r>
               <w:rPr>
                 <w:rFonts w:ascii="Consolas" w:hAnsi="Consolas" w:cs="Consolas"/>
-                <w:color w:val="808080"/>
-                <w:sz w:val="19"/>
-                <w:szCs w:val="19"/>
-                <w:lang w:val="en-US"/>
-              </w:rPr>
-              <w:t>AND</w:t>
-            </w:r>
-            <w:r>
-              <w:rPr>
-                <w:rFonts w:ascii="Consolas" w:hAnsi="Consolas" w:cs="Consolas"/>
-                <w:color w:val="000000"/>
-                <w:sz w:val="19"/>
-                <w:szCs w:val="19"/>
-                <w:lang w:val="en-US"/>
-              </w:rPr>
-              <w:t xml:space="preserve"> @TipoFactura </w:t>
+                <w:color w:val="000000"/>
+                <w:sz w:val="19"/>
+                <w:szCs w:val="19"/>
+                <w:lang w:val="en-US"/>
+              </w:rPr>
+              <w:t xml:space="preserve">TipoFactura </w:t>
             </w:r>
             <w:r>
               <w:rPr>
@@ -12816,7 +12488,6 @@
               </w:rPr>
               <w:tab/>
             </w:r>
-            <w:proofErr w:type="gramStart"/>
             <w:r>
               <w:rPr>
                 <w:rFonts w:ascii="Consolas" w:hAnsi="Consolas" w:cs="Consolas"/>
@@ -12865,20 +12536,8 @@
                 <w:szCs w:val="19"/>
                 <w:lang w:val="en-US"/>
               </w:rPr>
-              <w:t xml:space="preserve"> @</w:t>
-            </w:r>
-            <w:proofErr w:type="gramEnd"/>
-            <w:r>
-              <w:rPr>
-                <w:rFonts w:ascii="Consolas" w:hAnsi="Consolas" w:cs="Consolas"/>
-                <w:color w:val="000000"/>
-                <w:sz w:val="19"/>
-                <w:szCs w:val="19"/>
-                <w:lang w:val="en-US"/>
-              </w:rPr>
-              <w:t>ImporteTotal</w:t>
-            </w:r>
-            <w:proofErr w:type="gramStart"/>
+              <w:t xml:space="preserve"> @ImporteTotal</w:t>
+            </w:r>
             <w:r>
               <w:rPr>
                 <w:rFonts w:ascii="Consolas" w:hAnsi="Consolas" w:cs="Consolas"/>
@@ -12889,7 +12548,6 @@
               </w:rPr>
               <w:t>);</w:t>
             </w:r>
-            <w:proofErr w:type="gramEnd"/>
           </w:p>
           <w:p>
             <w:pPr>
@@ -13087,9 +12745,19 @@
                 <w:szCs w:val="19"/>
                 <w:lang w:val="en-US"/>
               </w:rPr>
-              <w:t>();</w:t>
+              <w:t>(</w:t>
             </w:r>
             <w:proofErr w:type="gramEnd"/>
+            <w:r>
+              <w:rPr>
+                <w:rFonts w:ascii="Consolas" w:hAnsi="Consolas" w:cs="Consolas"/>
+                <w:color w:val="808080"/>
+                <w:sz w:val="19"/>
+                <w:szCs w:val="19"/>
+                <w:lang w:val="en-US"/>
+              </w:rPr>
+              <w:t>);</w:t>
+            </w:r>
           </w:p>
           <w:p>
             <w:pPr>
@@ -13340,29 +13008,9 @@
                 <w:szCs w:val="19"/>
                 <w:lang w:val="en-US"/>
               </w:rPr>
-              <w:tab/>
-            </w:r>
-            <w:proofErr w:type="gramStart"/>
-            <w:r>
-              <w:rPr>
-                <w:rFonts w:ascii="Consolas" w:hAnsi="Consolas" w:cs="Consolas"/>
-                <w:color w:val="000000"/>
-                <w:sz w:val="19"/>
-                <w:szCs w:val="19"/>
-                <w:lang w:val="en-US"/>
-              </w:rPr>
-              <w:t>@idArticulo</w:t>
-            </w:r>
-            <w:proofErr w:type="gramEnd"/>
-            <w:r>
-              <w:rPr>
-                <w:rFonts w:ascii="Consolas" w:hAnsi="Consolas" w:cs="Consolas"/>
-                <w:color w:val="000000"/>
-                <w:sz w:val="19"/>
-                <w:szCs w:val="19"/>
-                <w:lang w:val="en-US"/>
-              </w:rPr>
-              <w:t xml:space="preserve"> </w:t>
+              <w:lastRenderedPageBreak/>
+              <w:tab/>
+              <w:t xml:space="preserve">@idArticulo </w:t>
             </w:r>
             <w:r>
               <w:rPr>
@@ -13819,7 +13467,6 @@
                 <w:szCs w:val="19"/>
                 <w:lang w:val="es-ES"/>
               </w:rPr>
-              <w:lastRenderedPageBreak/>
               <w:tab/>
             </w:r>
             <w:r>
@@ -14330,18 +13977,7 @@
                 <w:szCs w:val="19"/>
                 <w:lang w:val="en-US"/>
               </w:rPr>
-              <w:t xml:space="preserve"> @</w:t>
-            </w:r>
-            <w:proofErr w:type="gramStart"/>
-            <w:r>
-              <w:rPr>
-                <w:rFonts w:ascii="Consolas" w:hAnsi="Consolas" w:cs="Consolas"/>
-                <w:color w:val="000000"/>
-                <w:sz w:val="19"/>
-                <w:szCs w:val="19"/>
-                <w:lang w:val="en-US"/>
-              </w:rPr>
-              <w:t>idArticulo</w:t>
+              <w:t xml:space="preserve"> @idArticulo</w:t>
             </w:r>
             <w:r>
               <w:rPr>
@@ -14353,7 +13989,6 @@
               </w:rPr>
               <w:t>;</w:t>
             </w:r>
-            <w:proofErr w:type="gramEnd"/>
           </w:p>
           <w:p>
             <w:pPr>
@@ -14493,7 +14128,7 @@
                 <w:color w:val="000000"/>
                 <w:sz w:val="19"/>
                 <w:szCs w:val="19"/>
-                <w:lang w:val="en-US"/>
+                <w:lang w:val="es-AR"/>
               </w:rPr>
             </w:pPr>
             <w:r>
@@ -14543,7 +14178,7 @@
                 <w:color w:val="0000FF"/>
                 <w:sz w:val="19"/>
                 <w:szCs w:val="19"/>
-                <w:lang w:val="en-US"/>
+                <w:lang w:val="es-AR"/>
               </w:rPr>
               <w:t>RAISERROR</w:t>
             </w:r>
@@ -14553,7 +14188,7 @@
                 <w:color w:val="808080"/>
                 <w:sz w:val="19"/>
                 <w:szCs w:val="19"/>
-                <w:lang w:val="en-US"/>
+                <w:lang w:val="es-AR"/>
               </w:rPr>
               <w:t>(</w:t>
             </w:r>
@@ -14564,9 +14199,9 @@
                 <w:color w:val="FF0000"/>
                 <w:sz w:val="19"/>
                 <w:szCs w:val="19"/>
-                <w:lang w:val="en-US"/>
-              </w:rPr>
-              <w:t xml:space="preserve">'No </w:t>
+                <w:lang w:val="es-AR"/>
+              </w:rPr>
+              <w:t xml:space="preserve">'No existe este id de </w:t>
             </w:r>
             <w:proofErr w:type="spellStart"/>
             <w:r>
@@ -14575,9 +14210,9 @@
                 <w:color w:val="FF0000"/>
                 <w:sz w:val="19"/>
                 <w:szCs w:val="19"/>
-                <w:lang w:val="en-US"/>
-              </w:rPr>
-              <w:t>existe</w:t>
+                <w:lang w:val="es-AR"/>
+              </w:rPr>
+              <w:t>artítuclo</w:t>
             </w:r>
             <w:proofErr w:type="spellEnd"/>
             <w:r>
@@ -14586,51 +14221,7 @@
                 <w:color w:val="FF0000"/>
                 <w:sz w:val="19"/>
                 <w:szCs w:val="19"/>
-                <w:lang w:val="en-US"/>
-              </w:rPr>
-              <w:t xml:space="preserve"> </w:t>
-            </w:r>
-            <w:proofErr w:type="spellStart"/>
-            <w:r>
-              <w:rPr>
-                <w:rFonts w:ascii="Consolas" w:hAnsi="Consolas" w:cs="Consolas"/>
-                <w:color w:val="FF0000"/>
-                <w:sz w:val="19"/>
-                <w:szCs w:val="19"/>
-                <w:lang w:val="en-US"/>
-              </w:rPr>
-              <w:t>este</w:t>
-            </w:r>
-            <w:proofErr w:type="spellEnd"/>
-            <w:r>
-              <w:rPr>
-                <w:rFonts w:ascii="Consolas" w:hAnsi="Consolas" w:cs="Consolas"/>
-                <w:color w:val="FF0000"/>
-                <w:sz w:val="19"/>
-                <w:szCs w:val="19"/>
-                <w:lang w:val="en-US"/>
-              </w:rPr>
-              <w:t xml:space="preserve"> id de </w:t>
-            </w:r>
-            <w:proofErr w:type="spellStart"/>
-            <w:r>
-              <w:rPr>
-                <w:rFonts w:ascii="Consolas" w:hAnsi="Consolas" w:cs="Consolas"/>
-                <w:color w:val="FF0000"/>
-                <w:sz w:val="19"/>
-                <w:szCs w:val="19"/>
-                <w:lang w:val="en-US"/>
-              </w:rPr>
-              <w:t>artítuclo</w:t>
-            </w:r>
-            <w:proofErr w:type="spellEnd"/>
-            <w:r>
-              <w:rPr>
-                <w:rFonts w:ascii="Consolas" w:hAnsi="Consolas" w:cs="Consolas"/>
-                <w:color w:val="FF0000"/>
-                <w:sz w:val="19"/>
-                <w:szCs w:val="19"/>
-                <w:lang w:val="en-US"/>
+                <w:lang w:val="es-AR"/>
               </w:rPr>
               <w:t>'</w:t>
             </w:r>
@@ -14640,7 +14231,7 @@
                 <w:color w:val="808080"/>
                 <w:sz w:val="19"/>
                 <w:szCs w:val="19"/>
-                <w:lang w:val="en-US"/>
+                <w:lang w:val="es-AR"/>
               </w:rPr>
               <w:t>,</w:t>
             </w:r>
@@ -14650,7 +14241,7 @@
                 <w:color w:val="000000"/>
                 <w:sz w:val="19"/>
                 <w:szCs w:val="19"/>
-                <w:lang w:val="en-US"/>
+                <w:lang w:val="es-AR"/>
               </w:rPr>
               <w:t xml:space="preserve"> 16</w:t>
             </w:r>
@@ -14660,7 +14251,7 @@
                 <w:color w:val="808080"/>
                 <w:sz w:val="19"/>
                 <w:szCs w:val="19"/>
-                <w:lang w:val="en-US"/>
+                <w:lang w:val="es-AR"/>
               </w:rPr>
               <w:t>,</w:t>
             </w:r>
@@ -14670,22 +14261,20 @@
                 <w:color w:val="000000"/>
                 <w:sz w:val="19"/>
                 <w:szCs w:val="19"/>
-                <w:lang w:val="en-US"/>
+                <w:lang w:val="es-AR"/>
               </w:rPr>
               <w:t xml:space="preserve"> 1</w:t>
             </w:r>
-            <w:proofErr w:type="gramStart"/>
-            <w:r>
-              <w:rPr>
-                <w:rFonts w:ascii="Consolas" w:hAnsi="Consolas" w:cs="Consolas"/>
-                <w:color w:val="808080"/>
-                <w:sz w:val="19"/>
-                <w:szCs w:val="19"/>
-                <w:lang w:val="en-US"/>
+            <w:r>
+              <w:rPr>
+                <w:rFonts w:ascii="Consolas" w:hAnsi="Consolas" w:cs="Consolas"/>
+                <w:color w:val="808080"/>
+                <w:sz w:val="19"/>
+                <w:szCs w:val="19"/>
+                <w:lang w:val="es-AR"/>
               </w:rPr>
               <w:t>);</w:t>
             </w:r>
-            <w:proofErr w:type="gramEnd"/>
           </w:p>
           <w:p>
             <w:pPr>
@@ -14708,27 +14297,27 @@
                 <w:color w:val="000000"/>
                 <w:sz w:val="19"/>
                 <w:szCs w:val="19"/>
-                <w:lang w:val="en-US"/>
-              </w:rPr>
-              <w:tab/>
-            </w:r>
-            <w:r>
-              <w:rPr>
-                <w:rFonts w:ascii="Consolas" w:hAnsi="Consolas" w:cs="Consolas"/>
-                <w:color w:val="000000"/>
-                <w:sz w:val="19"/>
-                <w:szCs w:val="19"/>
-                <w:lang w:val="en-US"/>
-              </w:rPr>
-              <w:tab/>
-            </w:r>
-            <w:r>
-              <w:rPr>
-                <w:rFonts w:ascii="Consolas" w:hAnsi="Consolas" w:cs="Consolas"/>
-                <w:color w:val="000000"/>
-                <w:sz w:val="19"/>
-                <w:szCs w:val="19"/>
-                <w:lang w:val="en-US"/>
+                <w:lang w:val="es-AR"/>
+              </w:rPr>
+              <w:tab/>
+            </w:r>
+            <w:r>
+              <w:rPr>
+                <w:rFonts w:ascii="Consolas" w:hAnsi="Consolas" w:cs="Consolas"/>
+                <w:color w:val="000000"/>
+                <w:sz w:val="19"/>
+                <w:szCs w:val="19"/>
+                <w:lang w:val="es-AR"/>
+              </w:rPr>
+              <w:tab/>
+            </w:r>
+            <w:r>
+              <w:rPr>
+                <w:rFonts w:ascii="Consolas" w:hAnsi="Consolas" w:cs="Consolas"/>
+                <w:color w:val="000000"/>
+                <w:sz w:val="19"/>
+                <w:szCs w:val="19"/>
+                <w:lang w:val="es-AR"/>
               </w:rPr>
               <w:tab/>
             </w:r>
@@ -14804,7 +14393,6 @@
               </w:rPr>
               <w:tab/>
             </w:r>
-            <w:proofErr w:type="gramStart"/>
             <w:r>
               <w:rPr>
                 <w:rFonts w:ascii="Consolas" w:hAnsi="Consolas" w:cs="Consolas"/>
@@ -14833,18 +14421,7 @@
                 <w:szCs w:val="19"/>
                 <w:lang w:val="en-US"/>
               </w:rPr>
-              <w:t>@</w:t>
-            </w:r>
-            <w:proofErr w:type="gramEnd"/>
-            <w:r>
-              <w:rPr>
-                <w:rFonts w:ascii="Consolas" w:hAnsi="Consolas" w:cs="Consolas"/>
-                <w:color w:val="000000"/>
-                <w:sz w:val="19"/>
-                <w:szCs w:val="19"/>
-                <w:lang w:val="en-US"/>
-              </w:rPr>
-              <w:t xml:space="preserve">cantidad </w:t>
+              <w:t xml:space="preserve">@cantidad </w:t>
             </w:r>
             <w:r>
               <w:rPr>
@@ -15094,18 +14671,7 @@
                 <w:szCs w:val="19"/>
                 <w:lang w:val="en-US"/>
               </w:rPr>
-              <w:t xml:space="preserve"> @</w:t>
-            </w:r>
-            <w:proofErr w:type="gramStart"/>
-            <w:r>
-              <w:rPr>
-                <w:rFonts w:ascii="Consolas" w:hAnsi="Consolas" w:cs="Consolas"/>
-                <w:color w:val="000000"/>
-                <w:sz w:val="19"/>
-                <w:szCs w:val="19"/>
-                <w:lang w:val="en-US"/>
-              </w:rPr>
-              <w:t>idArticulo</w:t>
+              <w:t xml:space="preserve"> @idArticulo</w:t>
             </w:r>
             <w:r>
               <w:rPr>
@@ -15117,7 +14683,6 @@
               </w:rPr>
               <w:t>;</w:t>
             </w:r>
-            <w:proofErr w:type="gramEnd"/>
           </w:p>
           <w:p>
             <w:pPr>
@@ -16040,18 +15605,7 @@
                 <w:szCs w:val="19"/>
                 <w:lang w:val="en-US"/>
               </w:rPr>
-              <w:t xml:space="preserve"> @</w:t>
-            </w:r>
-            <w:proofErr w:type="gramStart"/>
-            <w:r>
-              <w:rPr>
-                <w:rFonts w:ascii="Consolas" w:hAnsi="Consolas" w:cs="Consolas"/>
-                <w:color w:val="000000"/>
-                <w:sz w:val="19"/>
-                <w:szCs w:val="19"/>
-                <w:lang w:val="en-US"/>
-              </w:rPr>
-              <w:t>idArticulo</w:t>
+              <w:t xml:space="preserve"> @idArticulo</w:t>
             </w:r>
             <w:r>
               <w:rPr>
@@ -16063,7 +15617,6 @@
               </w:rPr>
               <w:t>;</w:t>
             </w:r>
-            <w:proofErr w:type="gramEnd"/>
           </w:p>
           <w:p>
             <w:pPr>
@@ -16120,7 +15673,6 @@
               </w:rPr>
               <w:t xml:space="preserve"> </w:t>
             </w:r>
-            <w:proofErr w:type="gramStart"/>
             <w:r>
               <w:rPr>
                 <w:rFonts w:ascii="Consolas" w:hAnsi="Consolas" w:cs="Consolas"/>
@@ -16141,7 +15693,6 @@
               </w:rPr>
               <w:t>;</w:t>
             </w:r>
-            <w:proofErr w:type="gramEnd"/>
           </w:p>
           <w:p>
             <w:pPr>
@@ -16310,7 +15861,6 @@
               </w:rPr>
               <w:t xml:space="preserve"> </w:t>
             </w:r>
-            <w:proofErr w:type="gramStart"/>
             <w:r>
               <w:rPr>
                 <w:rFonts w:ascii="Consolas" w:hAnsi="Consolas" w:cs="Consolas"/>
@@ -16331,7 +15881,6 @@
               </w:rPr>
               <w:t>;</w:t>
             </w:r>
-            <w:proofErr w:type="gramEnd"/>
           </w:p>
           <w:p>
             <w:pPr>
@@ -16417,9 +15966,19 @@
                 <w:szCs w:val="19"/>
                 <w:lang w:val="en-US"/>
               </w:rPr>
-              <w:t>();</w:t>
+              <w:t>(</w:t>
             </w:r>
             <w:proofErr w:type="gramEnd"/>
+            <w:r>
+              <w:rPr>
+                <w:rFonts w:ascii="Consolas" w:hAnsi="Consolas" w:cs="Consolas"/>
+                <w:color w:val="808080"/>
+                <w:sz w:val="19"/>
+                <w:szCs w:val="19"/>
+                <w:lang w:val="en-US"/>
+              </w:rPr>
+              <w:t>);</w:t>
+            </w:r>
           </w:p>
           <w:p>
             <w:pPr>
@@ -16955,7 +16514,6 @@
               </w:rPr>
               <w:t xml:space="preserve"> </w:t>
             </w:r>
-            <w:proofErr w:type="gramStart"/>
             <w:r>
               <w:rPr>
                 <w:rFonts w:ascii="Consolas" w:hAnsi="Consolas" w:cs="Consolas"/>
@@ -16984,20 +16542,8 @@
                 <w:szCs w:val="19"/>
                 <w:lang w:val="en-US"/>
               </w:rPr>
-              <w:t>@</w:t>
-            </w:r>
-            <w:proofErr w:type="gramEnd"/>
-            <w:r>
-              <w:rPr>
-                <w:rFonts w:ascii="Consolas" w:hAnsi="Consolas" w:cs="Consolas"/>
-                <w:color w:val="000000"/>
-                <w:sz w:val="19"/>
-                <w:szCs w:val="19"/>
-                <w:lang w:val="en-US"/>
-              </w:rPr>
-              <w:t>nombreMarca</w:t>
-            </w:r>
-            <w:proofErr w:type="gramStart"/>
+              <w:t>@nombreMarca</w:t>
+            </w:r>
             <w:r>
               <w:rPr>
                 <w:rFonts w:ascii="Consolas" w:hAnsi="Consolas" w:cs="Consolas"/>
@@ -17008,7 +16554,6 @@
               </w:rPr>
               <w:t>);</w:t>
             </w:r>
-            <w:proofErr w:type="gramEnd"/>
           </w:p>
           <w:p>
             <w:pPr>
@@ -17206,9 +16751,19 @@
                 <w:szCs w:val="19"/>
                 <w:lang w:val="en-US"/>
               </w:rPr>
-              <w:t>();</w:t>
+              <w:t>(</w:t>
             </w:r>
             <w:proofErr w:type="gramEnd"/>
+            <w:r>
+              <w:rPr>
+                <w:rFonts w:ascii="Consolas" w:hAnsi="Consolas" w:cs="Consolas"/>
+                <w:color w:val="808080"/>
+                <w:sz w:val="19"/>
+                <w:szCs w:val="19"/>
+                <w:lang w:val="en-US"/>
+              </w:rPr>
+              <w:t>);</w:t>
+            </w:r>
           </w:p>
           <w:p>
             <w:pPr>
@@ -17222,7 +16777,7 @@
                 <w:color w:val="000000"/>
                 <w:sz w:val="19"/>
                 <w:szCs w:val="19"/>
-                <w:lang w:val="es-ES"/>
+                <w:lang w:val="en-US"/>
               </w:rPr>
             </w:pPr>
             <w:r>
@@ -17241,7 +16796,7 @@
                 <w:color w:val="0000FF"/>
                 <w:sz w:val="19"/>
                 <w:szCs w:val="19"/>
-                <w:lang w:val="es-ES"/>
+                <w:lang w:val="en-US"/>
               </w:rPr>
               <w:t>END</w:t>
             </w:r>
@@ -17251,7 +16806,7 @@
                 <w:color w:val="000000"/>
                 <w:sz w:val="19"/>
                 <w:szCs w:val="19"/>
-                <w:lang w:val="es-ES"/>
+                <w:lang w:val="en-US"/>
               </w:rPr>
               <w:t xml:space="preserve"> </w:t>
             </w:r>
@@ -17261,7 +16816,7 @@
                 <w:color w:val="0000FF"/>
                 <w:sz w:val="19"/>
                 <w:szCs w:val="19"/>
-                <w:lang w:val="es-ES"/>
+                <w:lang w:val="en-US"/>
               </w:rPr>
               <w:t>CATCH</w:t>
             </w:r>
@@ -17301,6 +16856,7 @@
       </w:pPr>
       <w:proofErr w:type="spellStart"/>
       <w:r>
+        <w:lastRenderedPageBreak/>
         <w:t>Trigger</w:t>
       </w:r>
       <w:proofErr w:type="spellEnd"/>
@@ -17438,34 +16994,7 @@
           <w:color w:val="000000"/>
           <w:lang w:val="es-AR"/>
         </w:rPr>
-        <w:t xml:space="preserve"> productos están actualmente sin stock, así que se les dará una baja lógica </w:t>
-      </w:r>
-      <w:proofErr w:type="gramStart"/>
-      <w:r>
-        <w:rPr>
-          <w:rFonts w:cs="Consolas"/>
-          <w:color w:val="000000"/>
-          <w:lang w:val="es-AR"/>
-        </w:rPr>
-        <w:t>del mismo</w:t>
-      </w:r>
-      <w:proofErr w:type="gramEnd"/>
-      <w:r>
-        <w:rPr>
-          <w:rFonts w:cs="Consolas"/>
-          <w:color w:val="000000"/>
-          <w:lang w:val="es-AR"/>
-        </w:rPr>
-        <w:t xml:space="preserve">”. </w:t>
-      </w:r>
-      <w:r>
-        <w:rPr>
-          <w:rFonts w:cs="Consolas"/>
-          <w:color w:val="000000"/>
-          <w:lang w:val="es-AR"/>
-        </w:rPr>
-        <w:lastRenderedPageBreak/>
-        <w:t xml:space="preserve">Entonces </w:t>
+        <w:t xml:space="preserve"> productos están actualmente sin stock, así que se les dará una baja lógica del mismo”. Entonces </w:t>
       </w:r>
       <w:r>
         <w:rPr>
@@ -18322,17 +17851,7 @@
                 <w:szCs w:val="16"/>
                 <w:lang w:val="en-US"/>
               </w:rPr>
-              <w:t>INSERTED.</w:t>
-            </w:r>
-            <w:proofErr w:type="gramStart"/>
-            <w:r>
-              <w:rPr>
-                <w:rFonts w:ascii="Consolas" w:hAnsi="Consolas" w:cs="Consolas"/>
-                <w:sz w:val="16"/>
-                <w:szCs w:val="16"/>
-                <w:lang w:val="en-US"/>
-              </w:rPr>
-              <w:t>IDArticulo</w:t>
+              <w:t>INSERTED.IDArticulo</w:t>
             </w:r>
             <w:proofErr w:type="spellEnd"/>
             <w:r>
@@ -18344,7 +17863,6 @@
               </w:rPr>
               <w:t>;</w:t>
             </w:r>
-            <w:proofErr w:type="gramEnd"/>
           </w:p>
           <w:p>
             <w:pPr>
@@ -18803,7 +18321,6 @@
               </w:rPr>
               <w:t xml:space="preserve"> </w:t>
             </w:r>
-            <w:proofErr w:type="gramStart"/>
             <w:r>
               <w:rPr>
                 <w:rFonts w:ascii="Consolas" w:hAnsi="Consolas" w:cs="Consolas"/>
@@ -18824,7 +18341,6 @@
               </w:rPr>
               <w:t>;</w:t>
             </w:r>
-            <w:proofErr w:type="gramEnd"/>
           </w:p>
           <w:p>
             <w:pPr>
@@ -18998,7 +18514,7 @@
                 <w:color w:val="000000"/>
                 <w:sz w:val="19"/>
                 <w:szCs w:val="19"/>
-                <w:lang w:val="en-US"/>
+                <w:lang w:val="es-AR"/>
               </w:rPr>
             </w:pPr>
             <w:r>
@@ -19017,7 +18533,7 @@
                 <w:color w:val="0000FF"/>
                 <w:sz w:val="19"/>
                 <w:szCs w:val="19"/>
-                <w:lang w:val="en-US"/>
+                <w:lang w:val="es-AR"/>
               </w:rPr>
               <w:t>SELECT</w:t>
             </w:r>
@@ -19027,7 +18543,7 @@
                 <w:color w:val="000000"/>
                 <w:sz w:val="19"/>
                 <w:szCs w:val="19"/>
-                <w:lang w:val="en-US"/>
+                <w:lang w:val="es-AR"/>
               </w:rPr>
               <w:t xml:space="preserve"> </w:t>
             </w:r>
@@ -19038,7 +18554,7 @@
                 <w:color w:val="FF00FF"/>
                 <w:sz w:val="19"/>
                 <w:szCs w:val="19"/>
-                <w:lang w:val="en-US"/>
+                <w:lang w:val="es-AR"/>
               </w:rPr>
               <w:t>SUM</w:t>
             </w:r>
@@ -19048,7 +18564,7 @@
                 <w:color w:val="808080"/>
                 <w:sz w:val="19"/>
                 <w:szCs w:val="19"/>
-                <w:lang w:val="en-US"/>
+                <w:lang w:val="es-AR"/>
               </w:rPr>
               <w:t>(</w:t>
             </w:r>
@@ -19059,7 +18575,7 @@
                 <w:color w:val="000000"/>
                 <w:sz w:val="19"/>
                 <w:szCs w:val="19"/>
-                <w:lang w:val="en-US"/>
+                <w:lang w:val="es-AR"/>
               </w:rPr>
               <w:t>AV</w:t>
             </w:r>
@@ -19069,7 +18585,7 @@
                 <w:color w:val="808080"/>
                 <w:sz w:val="19"/>
                 <w:szCs w:val="19"/>
-                <w:lang w:val="en-US"/>
+                <w:lang w:val="es-AR"/>
               </w:rPr>
               <w:t>.</w:t>
             </w:r>
@@ -19079,7 +18595,7 @@
                 <w:color w:val="000000"/>
                 <w:sz w:val="19"/>
                 <w:szCs w:val="19"/>
-                <w:lang w:val="en-US"/>
+                <w:lang w:val="es-AR"/>
               </w:rPr>
               <w:t>Cantidad</w:t>
             </w:r>
@@ -19091,7 +18607,7 @@
                 <w:color w:val="000000"/>
                 <w:sz w:val="19"/>
                 <w:szCs w:val="19"/>
-                <w:lang w:val="en-US"/>
+                <w:lang w:val="es-AR"/>
               </w:rPr>
               <w:t xml:space="preserve"> </w:t>
             </w:r>
@@ -19101,7 +18617,7 @@
                 <w:color w:val="808080"/>
                 <w:sz w:val="19"/>
                 <w:szCs w:val="19"/>
-                <w:lang w:val="en-US"/>
+                <w:lang w:val="es-AR"/>
               </w:rPr>
               <w:t>*</w:t>
             </w:r>
@@ -19111,7 +18627,7 @@
                 <w:color w:val="000000"/>
                 <w:sz w:val="19"/>
                 <w:szCs w:val="19"/>
-                <w:lang w:val="en-US"/>
+                <w:lang w:val="es-AR"/>
               </w:rPr>
               <w:t xml:space="preserve"> </w:t>
             </w:r>
@@ -19123,7 +18639,7 @@
                 <w:color w:val="000000"/>
                 <w:sz w:val="19"/>
                 <w:szCs w:val="19"/>
-                <w:lang w:val="en-US"/>
+                <w:lang w:val="es-AR"/>
               </w:rPr>
               <w:t>AV</w:t>
             </w:r>
@@ -19133,7 +18649,7 @@
                 <w:color w:val="808080"/>
                 <w:sz w:val="19"/>
                 <w:szCs w:val="19"/>
-                <w:lang w:val="en-US"/>
+                <w:lang w:val="es-AR"/>
               </w:rPr>
               <w:t>.</w:t>
             </w:r>
@@ -19143,7 +18659,7 @@
                 <w:color w:val="000000"/>
                 <w:sz w:val="19"/>
                 <w:szCs w:val="19"/>
-                <w:lang w:val="en-US"/>
+                <w:lang w:val="es-AR"/>
               </w:rPr>
               <w:t>PrecioUnitario</w:t>
             </w:r>
@@ -19155,7 +18671,7 @@
                 <w:color w:val="808080"/>
                 <w:sz w:val="19"/>
                 <w:szCs w:val="19"/>
-                <w:lang w:val="en-US"/>
+                <w:lang w:val="es-AR"/>
               </w:rPr>
               <w:t>)</w:t>
             </w:r>
@@ -19181,7 +18697,7 @@
                 <w:color w:val="000000"/>
                 <w:sz w:val="19"/>
                 <w:szCs w:val="19"/>
-                <w:lang w:val="en-US"/>
+                <w:lang w:val="es-AR"/>
               </w:rPr>
               <w:t xml:space="preserve">        </w:t>
             </w:r>
@@ -19721,7 +19237,19 @@
           <w:rPr>
             <w:rStyle w:val="Hipervnculo"/>
           </w:rPr>
-          <w:t>https://github.com/Salchy/TP-integrador-dbii</w:t>
+          <w:t>https://github.com/Salchy/TP-integrad</w:t>
+        </w:r>
+        <w:r>
+          <w:rPr>
+            <w:rStyle w:val="Hipervnculo"/>
+          </w:rPr>
+          <w:t>o</w:t>
+        </w:r>
+        <w:r>
+          <w:rPr>
+            <w:rStyle w:val="Hipervnculo"/>
+          </w:rPr>
+          <w:t>r-dbii</w:t>
         </w:r>
       </w:hyperlink>
     </w:p>
@@ -19748,7 +19276,19 @@
           <w:rPr>
             <w:rStyle w:val="Hipervnculo"/>
           </w:rPr>
-          <w:t>https://youtu.be/MrY-Yw_v4Yg</w:t>
+          <w:t>https://youtu.be/MrY-Y</w:t>
+        </w:r>
+        <w:r>
+          <w:rPr>
+            <w:rStyle w:val="Hipervnculo"/>
+          </w:rPr>
+          <w:t>w</w:t>
+        </w:r>
+        <w:r>
+          <w:rPr>
+            <w:rStyle w:val="Hipervnculo"/>
+          </w:rPr>
+          <w:t>_v4Yg</w:t>
         </w:r>
       </w:hyperlink>
     </w:p>
@@ -20706,6 +20246,7 @@
   <w:style w:type="character" w:default="1" w:styleId="Fuentedeprrafopredeter">
     <w:name w:val="Default Paragraph Font"/>
     <w:uiPriority w:val="1"/>
+    <w:semiHidden/>
     <w:unhideWhenUsed/>
   </w:style>
   <w:style w:type="table" w:default="1" w:styleId="Tablanormal">
@@ -20936,6 +20477,18 @@
         <w:insideV w:val="single" w:sz="4" w:space="0" w:color="auto"/>
       </w:tblBorders>
     </w:tblPr>
+  </w:style>
+  <w:style w:type="character" w:styleId="Hipervnculovisitado">
+    <w:name w:val="FollowedHyperlink"/>
+    <w:basedOn w:val="Fuentedeprrafopredeter"/>
+    <w:uiPriority w:val="99"/>
+    <w:semiHidden/>
+    <w:unhideWhenUsed/>
+    <w:rsid w:val="003405AA"/>
+    <w:rPr>
+      <w:color w:val="800080" w:themeColor="followedHyperlink"/>
+      <w:u w:val="single"/>
+    </w:rPr>
   </w:style>
 </w:styles>
 </file>

</xml_diff>